<commit_message>
Refine portfolio copy, fix panel alignment and nav click-through
</commit_message>
<xml_diff>
--- a/docs/Portfolio-Content.docx
+++ b/docs/Portfolio-Content.docx
@@ -110,7 +110,7 @@
           <w:color w:val="555555"/>
           <w:sz w:val="18"/>
         </w:rPr>
-        <w:t>Generated 25 July 2026</w:t>
+        <w:t>Generated 26 July 2026</w:t>
       </w:r>
     </w:p>
     <w:p>
@@ -973,7 +973,7 @@
           <w:color w:val="1A1A1A"/>
           <w:sz w:val="20"/>
         </w:rPr>
-        <w:t>I build production web and mobile products — and lead the teams that ship them.</w:t>
+        <w:t>I build web and mobile products, and I lead the teams that ship them.</w:t>
       </w:r>
     </w:p>
     <w:p>
@@ -996,7 +996,7 @@
           <w:color w:val="1A1A1A"/>
           <w:sz w:val="20"/>
         </w:rPr>
-        <w:t>Senior software engineer with 4+ years delivering web and mobile products end to end: requirements with the client, architecture, implementation, release, and everything in between.</w:t>
+        <w:t>Senior software engineer with 4+ years of experience. I take web and mobile products from the first client conversation through to the app store.</w:t>
       </w:r>
     </w:p>
     <w:p>
@@ -1184,7 +1184,7 @@
           <w:color w:val="1A1A1A"/>
           <w:sz w:val="20"/>
         </w:rPr>
-        <w:t>Senior software engineer with 4+ years of professional experience building and delivering web and mobile products for clients across the US, UK, UAE, and Pakistan. I work across the full delivery lifecycle — running client requirement sessions, breaking business goals into technical plans, writing production React, React Native, Next.js, and SvelteKit code, coordinating backend, QA, and design, and owning the release pipeline through App Store Connect, Google Play Console, and multi-environment configuration. I currently lead a 12-person cross-functional team, and I use AI-assisted engineering to become productive in unfamiliar codebases fast, including shipping production fixes in Flutter and C++ stacks I had not worked in before.</w:t>
+        <w:t>Senior software engineer with 4+ years of professional experience building web and mobile products for clients in the US, UK, UAE and Pakistan. My work covers the whole delivery cycle. I run requirement sessions with clients, turn what they need into technical plans, write the production React, React Native, Next.js and SvelteKit code, coordinate backend, QA and design, and handle releases through App Store Connect and Google Play. I currently lead a 12-person cross-functional team. I also use AI-assisted analysis to get productive in unfamiliar codebases quickly, which is how I shipped production fixes in Flutter and C++ without having worked in either before.</w:t>
       </w:r>
     </w:p>
     <w:p>
@@ -1249,7 +1249,7 @@
           <w:color w:val="1A1A1A"/>
           <w:sz w:val="20"/>
         </w:rPr>
-        <w:t>I started as a frontend developer and the title stopped describing the work a while ago. Today a typical week has me on a client call clarifying requirements, translating those requirements into tickets for the team, reviewing pull requests, writing production React Native or Next.js code, chasing down an environment misconfiguration before a release, and presenting the result back to the client.</w:t>
+        <w:t>I started out as a frontend developer. The title stopped describing the job a while ago. In a normal week I'll be on a call with a client working out what they actually need, turning that into tickets for the team, reviewing pull requests, writing production React Native or Next.js code, tracking down why staging is pointing at the wrong backend, and then showing the finished thing to the client.</w:t>
       </w:r>
     </w:p>
     <w:p>
@@ -1280,7 +1280,7 @@
           <w:color w:val="1A1A1A"/>
           <w:sz w:val="20"/>
         </w:rPr>
-        <w:t>That range is deliberate. I have found that the constraint on most projects is not any single technology — it is whether someone is holding the whole thing together: whether the requirement was understood, whether the backend contract matches what the app expects, whether staging points at the right environment, whether the build will actually pass review. I try to be that person.</w:t>
+        <w:t>That range is on purpose. On most projects the thing slowing delivery isn't the technology. It's whether anyone is holding the whole picture: did we understand what was asked for, does the backend contract match what the app expects, will this build pass review. I try to be the person holding that.</w:t>
       </w:r>
     </w:p>
     <w:p>
@@ -1311,7 +1311,7 @@
           <w:color w:val="1A1A1A"/>
           <w:sz w:val="20"/>
         </w:rPr>
-        <w:t>On the engineering side I work primarily in React, React Native, Next.js, and SvelteKit with TypeScript, Redux Toolkit, and Tailwind, backed by REST APIs, Firebase, and AWS services. I handle release engineering myself — Firebase configuration, native iOS and Android setup, App Store Connect and Google Play submissions, and separate development, staging, and production environments wired to the correct backends with secrets managed properly rather than committed.</w:t>
+        <w:t>The stack I work in most is React, React Native, Next.js and SvelteKit, with TypeScript, Redux Toolkit and Tailwind, against REST APIs, Firebase and AWS. I handle the release side myself. Firebase setup, native iOS and Android configuration, App Store Connect and Play Console submissions, and separate dev, staging and production environments pointed at the right backends. Secrets go in Secrets Manager, not the repo.</w:t>
       </w:r>
     </w:p>
     <w:p>
@@ -1342,7 +1342,7 @@
           <w:color w:val="1A1A1A"/>
           <w:sz w:val="20"/>
         </w:rPr>
-        <w:t>On the leadership side I currently lead a 12-person cross-functional team of frontend and backend developers, QA engineers, designers, and business analysts. I took that on mid-project when the Project Manager left an active engagement, and I now own planning, task assignment, review, risk tracking, and client communication for it while still contributing code.</w:t>
+        <w:t>I currently lead a team of twelve: frontend and backend developers, QA engineers, designers and business analysts. I picked that up in the middle of a live project when our Project Manager left. Planning, assigning work, reviewing what goes out, tracking risk and talking to the client are all mine now, and I still write code.</w:t>
       </w:r>
     </w:p>
     <w:p>
@@ -1373,7 +1373,7 @@
           <w:color w:val="1A1A1A"/>
           <w:sz w:val="20"/>
         </w:rPr>
-        <w:t>The last piece is speed of learning. I lean heavily on AI-assisted engineering — Claude, ChatGPT, Codex, and purpose-built agents I write for my own workflow — to get productive in unfamiliar codebases quickly. It is how I resolved production defects in a Flutter meditation app and a C++ mobile codebase without prior production experience in either language. I also build AI-powered workflow automations in n8n. I do not claim to be a Flutter or C++ specialist; I claim I can be useful in an unfamiliar stack in days rather than months.</w:t>
+        <w:t>The last piece is how fast I can pick up something new. I use AI heavily for this. Claude, ChatGPT, Codex, and agents I've built around my own workflow. It's how I fixed production bugs in a Flutter meditation app and a C++ mobile codebase without having shipped either language before. I also build workflow automations in n8n. To be clear about what I'm claiming: I'm not a Flutter or C++ specialist. I can be useful in a stack I don't know inside a week.</w:t>
       </w:r>
     </w:p>
     <w:p>
@@ -1423,7 +1423,7 @@
           <w:color w:val="1A1A1A"/>
           <w:sz w:val="19"/>
         </w:rPr>
-        <w:t>Stepped into delivery leadership of an active social platform build after the Project Manager departed. Now own planning, task assignment, code review, risk tracking, and client communication across frontend, backend, QA, design, and business analysis.</w:t>
+        <w:t>Took over delivery leadership on a live social platform build when the Project Manager left. Planning, task assignment, code review, risk tracking and client communication across frontend, backend, QA, design and business analysis.</w:t>
       </w:r>
     </w:p>
     <w:p>
@@ -1438,7 +1438,7 @@
           <w:color w:val="1A1A1A"/>
           <w:sz w:val="21"/>
         </w:rPr>
-        <w:t>Delivered for clients on four markets</w:t>
+        <w:t>Delivered for clients in four markets</w:t>
       </w:r>
     </w:p>
     <w:p>
@@ -1454,7 +1454,7 @@
           <w:color w:val="1A1A1A"/>
           <w:sz w:val="19"/>
         </w:rPr>
-        <w:t>Production software for organisations in the United States, United Kingdom, United Arab Emirates, and Pakistan — including national telecom operators Zong, Ufone, and Jazz.</w:t>
+        <w:t>Production software for companies in the United States, United Kingdom, United Arab Emirates and Pakistan. That includes Zong, Ufone and Jazz, the three largest mobile operators in Pakistan.</w:t>
       </w:r>
     </w:p>
     <w:p>
@@ -1485,7 +1485,7 @@
           <w:color w:val="1A1A1A"/>
           <w:sz w:val="19"/>
         </w:rPr>
-        <w:t>React and Next.js on the web, React Native and Expo on mobile, SvelteKit for high-performance PWAs — one engineer covering both surfaces of a product instead of handing off between them.</w:t>
+        <w:t>React and Next.js on the web, React Native and Expo on mobile, SvelteKit for PWAs that need to be fast. One engineer covering both sides of a product instead of handing off between them.</w:t>
       </w:r>
     </w:p>
     <w:p>
@@ -1500,7 +1500,7 @@
           <w:color w:val="1A1A1A"/>
           <w:sz w:val="21"/>
         </w:rPr>
-        <w:t>Productive in unfamiliar stacks fast</w:t>
+        <w:t>Gets productive in unfamiliar stacks fast</w:t>
       </w:r>
     </w:p>
     <w:p>
@@ -1516,7 +1516,7 @@
           <w:color w:val="1A1A1A"/>
           <w:sz w:val="19"/>
         </w:rPr>
-        <w:t>Resolved and shipped production defects in a Flutter codebase and a C++ mobile codebase with no prior production experience in either, using AI-assisted code analysis to build working context in days.</w:t>
+        <w:t>Fixed and shipped production bugs in a Flutter codebase and a C++ mobile codebase with no prior production experience in either. AI-assisted code analysis got me to working knowledge in days.</w:t>
       </w:r>
     </w:p>
     <w:p>
@@ -1547,7 +1547,7 @@
           <w:color w:val="1A1A1A"/>
           <w:sz w:val="19"/>
         </w:rPr>
-        <w:t>Firebase and native iOS/Android configuration, App Store Connect and Google Play Console submissions, separate development, staging, and production environments, and AWS Secrets Manager for credential handling.</w:t>
+        <w:t>Firebase and native iOS/Android configuration, App Store Connect and Play Console submissions, separate dev, staging and production environments, and AWS Secrets Manager for credentials.</w:t>
       </w:r>
     </w:p>
     <w:p>
@@ -1578,7 +1578,7 @@
           <w:color w:val="1A1A1A"/>
           <w:sz w:val="19"/>
         </w:rPr>
-        <w:t>Custom AI coding agents tuned to my own development workflow, plus AI-powered business workflow automation in n8n covering customer service, voice intake, and internal operations.</w:t>
+        <w:t>Custom AI coding agents tuned to how I work, plus business workflow automation in n8n covering customer service, voice intake and internal operations.</w:t>
       </w:r>
     </w:p>
     <w:p>
@@ -1696,7 +1696,7 @@
           <w:color w:val="1A1A1A"/>
           <w:sz w:val="19"/>
         </w:rPr>
-        <w:t>Performance optimisation</w:t>
+        <w:t>Performance optimization</w:t>
       </w:r>
     </w:p>
     <w:p>
@@ -2408,7 +2408,7 @@
           <w:color w:val="555555"/>
           <w:sz w:val="18"/>
         </w:rPr>
-        <w:t xml:space="preserve">  — Default choice for new work — typed contracts, state, and navigation</w:t>
+        <w:t xml:space="preserve">  — My default for new work. Typed contracts, state and navigation</w:t>
       </w:r>
     </w:p>
     <w:p>
@@ -3101,7 +3101,7 @@
           <w:color w:val="555555"/>
           <w:sz w:val="18"/>
         </w:rPr>
-        <w:t xml:space="preserve">  — Production defect resolution via AI-assisted analysis — not a core stack</w:t>
+        <w:t xml:space="preserve">  — Fixed production bugs using AI-assisted analysis. Not a core stack</w:t>
       </w:r>
     </w:p>
     <w:p>
@@ -3143,7 +3143,7 @@
           <w:color w:val="555555"/>
           <w:sz w:val="18"/>
         </w:rPr>
-        <w:t xml:space="preserve">  — Production debugging on a mobile codebase — not a core stack</w:t>
+        <w:t xml:space="preserve">  — Debugged a production mobile codebase. Not a core stack</w:t>
       </w:r>
     </w:p>
     <w:p>
@@ -3193,7 +3193,7 @@
           <w:color w:val="1A1A1A"/>
           <w:sz w:val="19"/>
         </w:rPr>
-        <w:t>End-to-end delivery of a web or mobile product — from requirement sessions through architecture, implementation, and store release.</w:t>
+        <w:t>Full delivery of a web or mobile product, from the first requirement session through architecture and build to the store release.</w:t>
       </w:r>
     </w:p>
     <w:p>
@@ -3295,7 +3295,7 @@
           <w:color w:val="1A1A1A"/>
           <w:sz w:val="19"/>
         </w:rPr>
-        <w:t>Taking ownership of a delivery that needs someone accountable: planning, coordination across disciplines, review, and client reporting.</w:t>
+        <w:t>Owning a delivery that needs someone accountable for it. Planning, coordination across disciplines, review, and reporting back to the client.</w:t>
       </w:r>
     </w:p>
     <w:p>
@@ -3397,7 +3397,7 @@
           <w:color w:val="1A1A1A"/>
           <w:sz w:val="19"/>
         </w:rPr>
-        <w:t>Cross-platform iOS and Android applications in React Native and Expo, including the native configuration and release work most teams get stuck on.</w:t>
+        <w:t>Cross-platform iOS and Android apps in React Native and Expo, including the native configuration and release work most teams get stuck on.</w:t>
       </w:r>
     </w:p>
     <w:p>
@@ -3499,7 +3499,7 @@
           <w:color w:val="1A1A1A"/>
           <w:sz w:val="19"/>
         </w:rPr>
-        <w:t>Automating operational and engineering workflows with n8n and AI agents, and integrating language models into existing products.</w:t>
+        <w:t>Automating operational and engineering workflows with n8n and AI agents, plus putting language models into products that already exist.</w:t>
       </w:r>
     </w:p>
     <w:p>
@@ -3601,7 +3601,7 @@
           <w:color w:val="1A1A1A"/>
           <w:sz w:val="19"/>
         </w:rPr>
-        <w:t>Diagnosing and fixing production issues in codebases nobody on your team currently owns, using AI-assisted analysis to build context quickly.</w:t>
+        <w:t>Finding and fixing production problems in code nobody on your team currently owns. AI-assisted analysis gets me oriented quickly.</w:t>
       </w:r>
     </w:p>
     <w:p>
@@ -3703,7 +3703,7 @@
           <w:color w:val="1A1A1A"/>
           <w:sz w:val="19"/>
         </w:rPr>
-        <w:t>High-performance PWAs with server-side rendering, offline capability, and the SEO characteristics marketing teams actually need.</w:t>
+        <w:t>Fast PWAs with server-side rendering, offline support, and the SEO behavior marketing teams keep asking for.</w:t>
       </w:r>
     </w:p>
     <w:p>
@@ -3760,7 +3760,7 @@
           <w:color w:val="1A1A1A"/>
           <w:sz w:val="19"/>
         </w:rPr>
-        <w:t>Offline &amp; caching behaviour</w:t>
+        <w:t>Offline &amp; caching behavior</w:t>
       </w:r>
     </w:p>
     <w:p>
@@ -3849,7 +3849,7 @@
           <w:color w:val="1A1A1A"/>
           <w:sz w:val="19"/>
         </w:rPr>
-        <w:t>Dec 2024 — Present</w:t>
+        <w:t>Dec 2024 – Present</w:t>
       </w:r>
     </w:p>
     <w:p>
@@ -3895,7 +3895,7 @@
           <w:color w:val="1A1A1A"/>
           <w:sz w:val="19"/>
         </w:rPr>
-        <w:t>Hired as Senior React &amp; React Native Developer; scope now spans technical leadership and delivery ownership</w:t>
+        <w:t>Hired as Senior React &amp; React Native Developer. The scope now includes technical leadership and delivery ownership.</w:t>
       </w:r>
     </w:p>
     <w:p>
@@ -3918,7 +3918,7 @@
           <w:color w:val="1A1A1A"/>
           <w:sz w:val="19"/>
         </w:rPr>
-        <w:t>Lead engineer and delivery owner across multiple concurrent client products, covering mobile and web implementation, cross-functional team leadership, release engineering, and direct client communication.</w:t>
+        <w:t>Lead engineer and delivery owner on several client products at once, covering the mobile and web build, cross-functional team leadership, releases, and talking to clients directly.</w:t>
       </w:r>
     </w:p>
     <w:p>
@@ -3947,7 +3947,7 @@
           <w:color w:val="1A1A1A"/>
           <w:sz w:val="19"/>
         </w:rPr>
-        <w:t>Lead delivery of a 12-person cross-functional team spanning frontend, backend, QA, design, and business analysis</w:t>
+        <w:t>Lead delivery for a 12-person cross-functional team covering frontend, backend, QA, design and business analysis</w:t>
       </w:r>
     </w:p>
     <w:p>
@@ -3961,7 +3961,7 @@
           <w:color w:val="1A1A1A"/>
           <w:sz w:val="19"/>
         </w:rPr>
-        <w:t>Run client requirement sessions, feature discussions, and release demonstrations directly with stakeholders</w:t>
+        <w:t>Run requirement sessions, feature discussions and release demos directly with clients</w:t>
       </w:r>
     </w:p>
     <w:p>
@@ -3975,7 +3975,7 @@
           <w:color w:val="1A1A1A"/>
           <w:sz w:val="19"/>
         </w:rPr>
-        <w:t>Break business requirements into technical tasks, plan sprints, and assign work across disciplines</w:t>
+        <w:t>Break business requirements into technical tasks, plan sprints and assign work across disciplines</w:t>
       </w:r>
     </w:p>
     <w:p>
@@ -3989,7 +3989,7 @@
           <w:color w:val="1A1A1A"/>
           <w:sz w:val="19"/>
         </w:rPr>
-        <w:t>Review team output before it reaches the client and enforce coding standards through pull request review</w:t>
+        <w:t>Review team output before it reaches the client, and hold coding standards through pull request review</w:t>
       </w:r>
     </w:p>
     <w:p>
@@ -4003,7 +4003,7 @@
           <w:color w:val="1A1A1A"/>
           <w:sz w:val="19"/>
         </w:rPr>
-        <w:t>Own release engineering: Firebase, native iOS and Android configuration, App Store Connect, and Google Play Console</w:t>
+        <w:t>Own releases: Firebase, native iOS and Android configuration, App Store Connect and Play Console</w:t>
       </w:r>
     </w:p>
     <w:p>
@@ -4017,7 +4017,7 @@
           <w:color w:val="1A1A1A"/>
           <w:sz w:val="19"/>
         </w:rPr>
-        <w:t>Configure development, staging, and production environments and verify each points at the correct backend</w:t>
+        <w:t>Set up dev, staging and production environments, and check each one points at the right backend</w:t>
       </w:r>
     </w:p>
     <w:p>
@@ -4046,7 +4046,7 @@
           <w:color w:val="1A1A1A"/>
           <w:sz w:val="19"/>
         </w:rPr>
-        <w:t>Assumed delivery leadership of an active social platform engagement mid-project after the Project Manager departed, taking on planning, coordination, and client reporting for a 12-person team without pausing the delivery schedule</w:t>
+        <w:t>Took over delivery leadership on a live social platform engagement when the Project Manager left. Picked up planning, coordination and client reporting for a 12-person team without pausing the schedule</w:t>
       </w:r>
     </w:p>
     <w:p>
@@ -4060,7 +4060,7 @@
           <w:color w:val="1A1A1A"/>
           <w:sz w:val="19"/>
         </w:rPr>
-        <w:t>Led the React Native build and team coordination for InvestWizz, a US investment platform, owning sprint planning and delivery management alongside hands-on development</w:t>
+        <w:t>Led the React Native build and team coordination for InvestWizz, a US investment platform, owning sprint planning and delivery alongside hands-on development</w:t>
       </w:r>
     </w:p>
     <w:p>
@@ -4074,7 +4074,7 @@
           <w:color w:val="1A1A1A"/>
           <w:sz w:val="19"/>
         </w:rPr>
-        <w:t>Resolved production defects in Vastu, a Flutter meditation application, despite no prior production Flutter experience — used AI-assisted analysis to build working knowledge of the codebase and shipped the fixes the client had engaged us for</w:t>
+        <w:t>Fixed production bugs in Vastu, a Flutter meditation app, with no prior production Flutter experience. Used AI-assisted analysis to learn the codebase and shipped the fixes the client hired us for</w:t>
       </w:r>
     </w:p>
     <w:p>
@@ -4088,7 +4088,7 @@
           <w:color w:val="1A1A1A"/>
           <w:sz w:val="19"/>
         </w:rPr>
-        <w:t>Diagnosed and fixed defects in Walkaround, a mobile product built on a C++ codebase, working from basic C++ familiarity and AI-assisted code comprehension</w:t>
+        <w:t>Traced and fixed bugs in Walkaround, a mobile product on a C++ codebase, working from basic C++ knowledge and AI-assisted code reading</w:t>
       </w:r>
     </w:p>
     <w:p>
@@ -4102,7 +4102,7 @@
           <w:color w:val="1A1A1A"/>
           <w:sz w:val="19"/>
         </w:rPr>
-        <w:t>Delivered CallMe, a compliance-sensitive communication platform for calling incarcerated family members through government-approved numbers, handling the constraints that regulated telephony imposes on client-side flows</w:t>
+        <w:t>Delivered CallMe, a communication platform for calling incarcerated family members through government-approved numbers, working inside the constraints regulated telephony puts on client-side flows</w:t>
       </w:r>
     </w:p>
     <w:p>
@@ -4116,7 +4116,7 @@
           <w:color w:val="1A1A1A"/>
           <w:sz w:val="19"/>
         </w:rPr>
-        <w:t>Built AI-powered workflow automations in n8n and custom AI coding agents tuned to the team's development workflow</w:t>
+        <w:t>Built AI-powered workflow automations in n8n, plus custom coding agents tuned to how the team works</w:t>
       </w:r>
     </w:p>
     <w:p>
@@ -4130,7 +4130,7 @@
           <w:color w:val="1A1A1A"/>
           <w:sz w:val="19"/>
         </w:rPr>
-        <w:t>Established token and refresh-token authentication flows with protected navigation, and standardised Redux Toolkit state architecture across projects</w:t>
+        <w:t>Set up token and refresh-token auth with protected navigation, and standardized how Redux Toolkit state is structured across projects</w:t>
       </w:r>
     </w:p>
     <w:p>
@@ -4144,7 +4144,7 @@
           <w:color w:val="1A1A1A"/>
           <w:sz w:val="19"/>
         </w:rPr>
-        <w:t>Mentored junior developers through structured code review and pairing</w:t>
+        <w:t>Mentored junior developers through code review and pairing</w:t>
       </w:r>
     </w:p>
     <w:p>
@@ -4226,7 +4226,7 @@
           <w:color w:val="1A1A1A"/>
           <w:sz w:val="19"/>
         </w:rPr>
-        <w:t>Jun 2024 — Jan 2025</w:t>
+        <w:t>Jun 2024 – Jan 2025</w:t>
       </w:r>
     </w:p>
     <w:p>
@@ -4272,7 +4272,7 @@
           <w:color w:val="1A1A1A"/>
           <w:sz w:val="19"/>
         </w:rPr>
-        <w:t>Senior frontend engineer on a network-integrated portal platform, leading the interface build and API integration for a responsive progressive web application.</w:t>
+        <w:t>Senior frontend engineer on a network-integrated portal platform, leading the interface build and API integration for a responsive progressive web app.</w:t>
       </w:r>
     </w:p>
     <w:p>
@@ -4301,7 +4301,7 @@
           <w:color w:val="1A1A1A"/>
           <w:sz w:val="19"/>
         </w:rPr>
-        <w:t>Build production UI in Next.js with TypeScript, Tailwind CSS, ShadCN, and NextUI</w:t>
+        <w:t>Build production UI in Next.js with TypeScript, Tailwind CSS, ShadCN and NextUI</w:t>
       </w:r>
     </w:p>
     <w:p>
@@ -4315,7 +4315,7 @@
           <w:color w:val="1A1A1A"/>
           <w:sz w:val="19"/>
         </w:rPr>
-        <w:t>Integrate REST and FastAPI endpoints for dynamic data flows</w:t>
+        <w:t>Integrate REST and FastAPI endpoints for dynamic data</w:t>
       </w:r>
     </w:p>
     <w:p>
@@ -4329,7 +4329,7 @@
           <w:color w:val="1A1A1A"/>
           <w:sz w:val="19"/>
         </w:rPr>
-        <w:t>Ensure cross-browser and cross-device responsiveness</w:t>
+        <w:t>Keep the layout working across browsers and screen sizes</w:t>
       </w:r>
     </w:p>
     <w:p>
@@ -4343,7 +4343,7 @@
           <w:color w:val="1A1A1A"/>
           <w:sz w:val="19"/>
         </w:rPr>
-        <w:t>Optimise web performance and page delivery</w:t>
+        <w:t>Improve web performance and page delivery</w:t>
       </w:r>
     </w:p>
     <w:p>
@@ -4372,7 +4372,7 @@
           <w:color w:val="1A1A1A"/>
           <w:sz w:val="19"/>
         </w:rPr>
-        <w:t>Led development of a network-integrated portal system, taking responsibility for the frontend architecture and its integration surface with backend services</w:t>
+        <w:t>Led development of a network-integrated portal system, owning the frontend architecture and where it met the backend services</w:t>
       </w:r>
     </w:p>
     <w:p>
@@ -4386,7 +4386,7 @@
           <w:color w:val="1A1A1A"/>
           <w:sz w:val="19"/>
         </w:rPr>
-        <w:t>Delivered a responsive progressive web application that held up consistently across desktop, tablet, and mobile</w:t>
+        <w:t>Delivered a responsive progressive web app that behaved consistently on desktop, tablet and mobile</w:t>
       </w:r>
     </w:p>
     <w:p>
@@ -4400,7 +4400,7 @@
           <w:color w:val="1A1A1A"/>
           <w:sz w:val="19"/>
         </w:rPr>
-        <w:t>Built a reusable component layer on ShadCN and NextUI that reduced duplicated UI work across portal modules</w:t>
+        <w:t>Built a reusable component layer on ShadCN and NextUI that cut duplicated UI work across portal modules</w:t>
       </w:r>
     </w:p>
     <w:p>
@@ -4414,7 +4414,7 @@
           <w:color w:val="1A1A1A"/>
           <w:sz w:val="19"/>
         </w:rPr>
-        <w:t>Wired dynamic data interaction through REST and FastAPI integrations, replacing static placeholder content with live backend data</w:t>
+        <w:t>Wired up REST and FastAPI integrations to replace static placeholder content with live backend data</w:t>
       </w:r>
     </w:p>
     <w:p>
@@ -4496,7 +4496,7 @@
           <w:color w:val="1A1A1A"/>
           <w:sz w:val="19"/>
         </w:rPr>
-        <w:t>Jul 2023 — Jul 2024</w:t>
+        <w:t>Jul 2023 – Jul 2024</w:t>
       </w:r>
     </w:p>
     <w:p>
@@ -4542,7 +4542,7 @@
           <w:color w:val="1A1A1A"/>
           <w:sz w:val="19"/>
         </w:rPr>
-        <w:t>Frontend engineer delivering progressive web applications for Pakistan's largest telecom operators, and the point at which my work expanded from interface development into server-side rendering and data layer ownership.</w:t>
+        <w:t>Frontend engineer building progressive web apps for the largest telecom operators in Pakistan. This is where my work grew past the interface into server-side rendering and owning the data layer.</w:t>
       </w:r>
     </w:p>
     <w:p>
@@ -4571,7 +4571,7 @@
           <w:color w:val="1A1A1A"/>
           <w:sz w:val="19"/>
         </w:rPr>
-        <w:t>Build progressive web applications in SvelteKit with server-side and client-side rendering</w:t>
+        <w:t>Build progressive web apps in SvelteKit using both server-side and client-side rendering</w:t>
       </w:r>
     </w:p>
     <w:p>
@@ -4585,7 +4585,7 @@
           <w:color w:val="1A1A1A"/>
           <w:sz w:val="19"/>
         </w:rPr>
-        <w:t>Implement CRUD operations and data access layers</w:t>
+        <w:t>Write CRUD operations and data access layers</w:t>
       </w:r>
     </w:p>
     <w:p>
@@ -4599,7 +4599,7 @@
           <w:color w:val="1A1A1A"/>
           <w:sz w:val="19"/>
         </w:rPr>
-        <w:t>Collaborate directly with design teams, working in Figma</w:t>
+        <w:t>Work directly with the design team in Figma</w:t>
       </w:r>
     </w:p>
     <w:p>
@@ -4613,7 +4613,7 @@
           <w:color w:val="1A1A1A"/>
           <w:sz w:val="19"/>
         </w:rPr>
-        <w:t>Prepare builds for client review and deployment approval</w:t>
+        <w:t>Prepare builds for client review and sign-off</w:t>
       </w:r>
     </w:p>
     <w:p>
@@ -4642,7 +4642,7 @@
           <w:color w:val="1A1A1A"/>
           <w:sz w:val="19"/>
         </w:rPr>
-        <w:t>Delivered and secured client approval for three telecom PWAs for Zong, Ufone, and Jazz — Pakistan's largest mobile operators — each requiring its own data model and rendering strategy</w:t>
+        <w:t>Delivered three telecom PWAs and got client sign-off on all of them, for Zong, Ufone and Jazz, the largest mobile operators in Pakistan. Each one needed its own data model and rendering approach</w:t>
       </w:r>
     </w:p>
     <w:p>
@@ -4656,7 +4656,7 @@
           <w:color w:val="1A1A1A"/>
           <w:sz w:val="19"/>
         </w:rPr>
-        <w:t>Extended scope from frontend into full-stack delivery with SvelteKit, taking ownership of server-side rendering decisions and data access rather than consuming a finished API</w:t>
+        <w:t>Grew from frontend work into full-stack delivery with SvelteKit, taking on rendering decisions and data access instead of just consuming a finished API</w:t>
       </w:r>
     </w:p>
     <w:p>
@@ -4670,7 +4670,7 @@
           <w:color w:val="1A1A1A"/>
           <w:sz w:val="19"/>
         </w:rPr>
-        <w:t>Integrated PocketBase as the data backend for the Jazz platform, handling data management and retrieval end to end</w:t>
+        <w:t>Integrated PocketBase as the data backend for the Jazz platform, handling storage and retrieval end to end</w:t>
       </w:r>
     </w:p>
     <w:p>
@@ -4684,7 +4684,7 @@
           <w:color w:val="1A1A1A"/>
           <w:sz w:val="19"/>
         </w:rPr>
-        <w:t>Worked directly in Figma with designers, editing designs in place to resolve implementation conflicts before they reached development</w:t>
+        <w:t>Worked in Figma alongside the designers, editing files directly to settle implementation conflicts before they reached development</w:t>
       </w:r>
     </w:p>
     <w:p>
@@ -4698,7 +4698,7 @@
           <w:color w:val="1A1A1A"/>
           <w:sz w:val="19"/>
         </w:rPr>
-        <w:t>Handled server-side and client-side rendering boundaries deliberately to keep user data integrity intact across PWA sessions</w:t>
+        <w:t>Drew the server-side and client-side rendering boundaries carefully so user data stayed intact across PWA sessions</w:t>
       </w:r>
     </w:p>
     <w:p>
@@ -4780,7 +4780,7 @@
           <w:color w:val="1A1A1A"/>
           <w:sz w:val="19"/>
         </w:rPr>
-        <w:t>Dec 2022 — Jul 2023</w:t>
+        <w:t>Dec 2022 – Jul 2023</w:t>
       </w:r>
     </w:p>
     <w:p>
@@ -4826,7 +4826,7 @@
           <w:color w:val="1A1A1A"/>
           <w:sz w:val="19"/>
         </w:rPr>
-        <w:t>First leadership role: coordinating cross-disciplinary delivery on technical projects while building responsive frontend interfaces.</w:t>
+        <w:t>My first leadership role. Coordinating delivery across disciplines on technical projects while building responsive frontend interfaces.</w:t>
       </w:r>
     </w:p>
     <w:p>
@@ -4855,7 +4855,7 @@
           <w:color w:val="1A1A1A"/>
           <w:sz w:val="19"/>
         </w:rPr>
-        <w:t>Coordinate cross-disciplinary teams to hit delivery dates and budgets</w:t>
+        <w:t>Coordinate teams across disciplines to hit delivery dates and budgets</w:t>
       </w:r>
     </w:p>
     <w:p>
@@ -4883,7 +4883,7 @@
           <w:color w:val="1A1A1A"/>
           <w:sz w:val="19"/>
         </w:rPr>
-        <w:t>Establish version control practice across the team</w:t>
+        <w:t>Set up version control practice for the team</w:t>
       </w:r>
     </w:p>
     <w:p>
@@ -4897,7 +4897,7 @@
           <w:color w:val="1A1A1A"/>
           <w:sz w:val="19"/>
         </w:rPr>
-        <w:t>Contribute to an efficient shared development pipeline</w:t>
+        <w:t>Help make the shared development pipeline work better</w:t>
       </w:r>
     </w:p>
     <w:p>
@@ -4926,7 +4926,7 @@
           <w:color w:val="1A1A1A"/>
           <w:sz w:val="19"/>
         </w:rPr>
-        <w:t>Coordinated cross-disciplinary teams through delivery of technical initiatives on schedule and within budget — the first role where my responsibility extended past my own tickets</w:t>
+        <w:t>Coordinated teams across disciplines to deliver technical projects on time and on budget. This was the first role where I was responsible for more than my own tickets</w:t>
       </w:r>
     </w:p>
     <w:p>
@@ -4940,7 +4940,7 @@
           <w:color w:val="1A1A1A"/>
           <w:sz w:val="19"/>
         </w:rPr>
-        <w:t>Introduced structured Git workflow and branching practice, removing the merge conflicts and overwritten work that had been slowing the team down</w:t>
+        <w:t>Introduced a proper Git workflow and branching strategy, which ended the merge conflicts and overwritten work that had been slowing everyone down</w:t>
       </w:r>
     </w:p>
     <w:p>
@@ -4954,7 +4954,7 @@
           <w:color w:val="1A1A1A"/>
           <w:sz w:val="19"/>
         </w:rPr>
-        <w:t>Built responsive layouts that held together across viewport sizes, and improved handover quality across the shared development pipeline</w:t>
+        <w:t>Built responsive layouts that held up across screen sizes, and improved how work was handed over inside the team</w:t>
       </w:r>
     </w:p>
     <w:p>
@@ -5057,7 +5057,7 @@
           <w:color w:val="555555"/>
           <w:sz w:val="18"/>
         </w:rPr>
-        <w:t xml:space="preserve">  —  Technical Lead &amp; Senior Software Engineer  ·  Feb 2026 — Present</w:t>
+        <w:t xml:space="preserve">  —  Technical Lead &amp; Senior Software Engineer  ·  Feb 2026 – Present</w:t>
       </w:r>
     </w:p>
     <w:p>
@@ -5090,7 +5090,7 @@
           <w:color w:val="555555"/>
           <w:sz w:val="18"/>
         </w:rPr>
-        <w:t xml:space="preserve">  —  Team Lead &amp; React Native Developer  ·  Sep 2025 — Feb 2026</w:t>
+        <w:t xml:space="preserve">  —  Team Lead &amp; React Native Developer  ·  Sep 2025 – Feb 2026</w:t>
       </w:r>
     </w:p>
     <w:p>
@@ -5123,7 +5123,7 @@
           <w:color w:val="555555"/>
           <w:sz w:val="18"/>
         </w:rPr>
-        <w:t xml:space="preserve">  —  Production Support Engineer (AI-assisted)  ·  Jul 2025 — Sep 2025</w:t>
+        <w:t xml:space="preserve">  —  Production Support Engineer (AI-assisted)  ·  Jul 2025 – Sep 2025</w:t>
       </w:r>
     </w:p>
     <w:p>
@@ -5156,7 +5156,7 @@
           <w:color w:val="555555"/>
           <w:sz w:val="18"/>
         </w:rPr>
-        <w:t xml:space="preserve">  —  Automation Engineer &amp; AI Agent Architect  ·  Jun 2025 — Present</w:t>
+        <w:t xml:space="preserve">  —  Automation Engineer &amp; AI Agent Architect  ·  Jun 2025 – Present</w:t>
       </w:r>
     </w:p>
     <w:p>
@@ -5189,7 +5189,7 @@
           <w:color w:val="555555"/>
           <w:sz w:val="18"/>
         </w:rPr>
-        <w:t xml:space="preserve">  —  Production Support Engineer (AI-assisted)  ·  Apr 2025 — Jun 2025</w:t>
+        <w:t xml:space="preserve">  —  Production Support Engineer (AI-assisted)  ·  Apr 2025 – Jun 2025</w:t>
       </w:r>
     </w:p>
     <w:p>
@@ -5222,7 +5222,7 @@
           <w:color w:val="555555"/>
           <w:sz w:val="18"/>
         </w:rPr>
-        <w:t xml:space="preserve">  —  Senior Mobile Engineer  ·  Jan 2025 — Apr 2025</w:t>
+        <w:t xml:space="preserve">  —  Senior Mobile Engineer  ·  Jan 2025 – Apr 2025</w:t>
       </w:r>
     </w:p>
     <w:p>
@@ -5255,7 +5255,7 @@
           <w:color w:val="555555"/>
           <w:sz w:val="18"/>
         </w:rPr>
-        <w:t xml:space="preserve">  —  Senior Mobile Engineer  ·  Nov 2024 — Mar 2025</w:t>
+        <w:t xml:space="preserve">  —  Senior Mobile Engineer  ·  Nov 2024 – Mar 2025</w:t>
       </w:r>
     </w:p>
     <w:p>
@@ -5288,7 +5288,7 @@
           <w:color w:val="555555"/>
           <w:sz w:val="18"/>
         </w:rPr>
-        <w:t xml:space="preserve">  —  Frontend Developer  ·  Oct 2023 — Feb 2024</w:t>
+        <w:t xml:space="preserve">  —  Frontend Developer  ·  Oct 2023 – Feb 2024</w:t>
       </w:r>
     </w:p>
     <w:p>
@@ -5391,7 +5391,7 @@
           <w:color w:val="1A1A1A"/>
           <w:sz w:val="19"/>
         </w:rPr>
-        <w:t>Feb 2026 — Present (Ongoing)</w:t>
+        <w:t>Feb 2026 – Present (Ongoing)</w:t>
       </w:r>
     </w:p>
     <w:p>
@@ -5437,7 +5437,7 @@
           <w:color w:val="1A1A1A"/>
           <w:sz w:val="19"/>
         </w:rPr>
-        <w:t>Confidential — under active development</w:t>
+        <w:t>Confidential, under active development</w:t>
       </w:r>
     </w:p>
     <w:p>
@@ -5560,7 +5560,7 @@
           <w:color w:val="1A1A1A"/>
           <w:sz w:val="19"/>
         </w:rPr>
-        <w:t>A social and creator platform spanning web and mobile. I lead a 12-person cross-functional team across both surfaces, having taken over delivery leadership mid-project after the Project Manager departed.</w:t>
+        <w:t>A social and creator platform across web and mobile. I lead a 12-person cross-functional team on both sides of it, after taking over delivery leadership partway through when the Project Manager left.</w:t>
       </w:r>
     </w:p>
     <w:p>
@@ -5592,7 +5592,7 @@
           <w:color w:val="1A1A1A"/>
           <w:sz w:val="19"/>
         </w:rPr>
-        <w:t>An in-development social and creator platform built across web and mobile. I lead delivery for a 12-person cross-functional team — frontend developers, backend developers, QA engineers, designers, and business analysts — while remaining hands-on across both the web and mobile codebases. I inherited this leadership responsibility mid-engagement when the Project Manager left, and picked up planning, task assignment, review, risk tracking, and direct client communication without interrupting the delivery schedule. The client and product remain unnamed while the build is in progress.</w:t>
+        <w:t>A social and creator platform, still in development, built across web and mobile. I lead delivery for a team of twelve: frontend and backend developers, QA engineers, designers and business analysts. I'm still hands-on in both the web and mobile codebases. The leadership side came to me partway through the engagement when the Project Manager left, and I picked up planning, task assignment, review, risk tracking and client communication without the schedule slipping. The client and product stay unnamed while the build is in progress.</w:t>
       </w:r>
     </w:p>
     <w:p>
@@ -5734,7 +5734,7 @@
           <w:color w:val="1A1A1A"/>
           <w:sz w:val="19"/>
         </w:rPr>
-        <w:t>Web and mobile surfaces developed in parallel, risking divergent behaviour and duplicated logic</w:t>
+        <w:t>Web and mobile surfaces developed in parallel, risking divergent behavior and duplicated logic</w:t>
       </w:r>
     </w:p>
     <w:p>
@@ -5777,7 +5777,7 @@
           <w:color w:val="1A1A1A"/>
           <w:sz w:val="19"/>
         </w:rPr>
-        <w:t>Took over delivery ownership directly rather than waiting for a replacement, absorbing planning, assignment, and client reporting into my own remit</w:t>
+        <w:t>Took over delivery myself instead of waiting for a replacement, and absorbed planning, assignment and client reporting</w:t>
       </w:r>
     </w:p>
     <w:p>
@@ -5805,7 +5805,7 @@
           <w:color w:val="1A1A1A"/>
           <w:sz w:val="19"/>
         </w:rPr>
-        <w:t>Kept shared behaviour and data contracts aligned deliberately across web and mobile instead of letting each surface drift</w:t>
+        <w:t>Kept shared behavior and data contracts aligned across web and mobile so neither side drifted</w:t>
       </w:r>
     </w:p>
     <w:p>
@@ -6061,7 +6061,7 @@
           <w:color w:val="1A1A1A"/>
           <w:sz w:val="19"/>
         </w:rPr>
-        <w:t>Sep 2025 — Feb 2026 (6 months)</w:t>
+        <w:t>Sep 2025 – Feb 2026 (6 months)</w:t>
       </w:r>
     </w:p>
     <w:p>
@@ -6207,7 +6207,7 @@
           <w:color w:val="1A1A1A"/>
           <w:sz w:val="19"/>
         </w:rPr>
-        <w:t>A US investment platform where I combined team leadership and delivery management with hands-on React Native development — one of my strongest engagements.</w:t>
+        <w:t>A US investment platform where I did the team leadership and delivery management as well as the React Native build. One of my strongest engagements.</w:t>
       </w:r>
     </w:p>
     <w:p>
@@ -6239,7 +6239,7 @@
           <w:color w:val="1A1A1A"/>
           <w:sz w:val="19"/>
         </w:rPr>
-        <w:t>InvestWizz is an investment platform for the US market, delivered as a React Native mobile application. My role combined two halves: leading the team and owning delivery — sprint planning, task assignment, coordination, and client communication — while building production features myself. Financial products carry a low tolerance for ambiguity in data handling and state, so a significant part of the work was making sure the app's model of a user's holdings stayed correct and legible under every network and navigation condition.</w:t>
+        <w:t>InvestWizz is an investment platform for the US market, built as a React Native mobile app. The role had two halves. I led the team and owned delivery, which meant sprint planning, task assignment, coordination and client communication. I also built production features myself. Financial products leave very little room for ambiguity in how data and state are handled, so a lot of the work went into making sure the app's picture of a user's holdings stayed correct and readable under every network and navigation condition.</w:t>
       </w:r>
     </w:p>
     <w:p>
@@ -6452,7 +6452,7 @@
           <w:color w:val="1A1A1A"/>
           <w:sz w:val="19"/>
         </w:rPr>
-        <w:t>Established an asynchronous communication rhythm — written updates and recorded demonstrations — so the client stayed informed without waiting on overlapping hours</w:t>
+        <w:t>Set up a rhythm of written updates and recorded demos so the client stayed informed without waiting for overlapping working hours</w:t>
       </w:r>
     </w:p>
     <w:p>
@@ -6708,7 +6708,7 @@
           <w:color w:val="1A1A1A"/>
           <w:sz w:val="19"/>
         </w:rPr>
-        <w:t>Jul 2025 — Sep 2025 (3 months)</w:t>
+        <w:t>Jul 2025 – Sep 2025 (3 months)</w:t>
       </w:r>
     </w:p>
     <w:p>
@@ -6854,7 +6854,7 @@
           <w:color w:val="1A1A1A"/>
           <w:sz w:val="19"/>
         </w:rPr>
-        <w:t>A Flutter meditation application where the client engaged us purely to resolve production bugs — in a framework I had not worked in before.</w:t>
+        <w:t>A Flutter meditation app where the client hired us purely to fix production bugs, in a framework I hadn't worked in before.</w:t>
       </w:r>
     </w:p>
     <w:p>
@@ -6886,7 +6886,7 @@
           <w:color w:val="1A1A1A"/>
           <w:sz w:val="19"/>
         </w:rPr>
-        <w:t>Vastu is a meditation application built in Flutter. The client engaged us specifically to resolve production bugs, not to build features. Flutter and Dart were outside my working stack, and the engagement had no ramp-up period budgeted. I used AI-assisted code analysis to build a working understanding of the codebase — its widget tree, state handling, and platform integration points — quickly enough to be useful in days rather than weeks, then diagnosed and resolved the defects and delivered the fixes. This project is on my portfolio as evidence of adaptability, not as a claim to Flutter expertise.</w:t>
+        <w:t>Vastu is a meditation app built in Flutter. The client hired us specifically to fix production bugs, not to build features. Flutter and Dart weren't part of my working stack, and nobody had budgeted time for me to learn them. I used AI-assisted code analysis to build a working understanding of the codebase, its widget tree, how it handled state and where it touched the platform. That took days instead of weeks. From there I found the causes, fixed them and delivered. This project is on my portfolio as evidence I adapt, not as a claim to know Flutter.</w:t>
       </w:r>
     </w:p>
     <w:p>
@@ -7057,7 +7057,7 @@
           <w:color w:val="1A1A1A"/>
           <w:sz w:val="19"/>
         </w:rPr>
-        <w:t>Reproduced each reported defect first, so fixes addressed causes rather than symptoms</w:t>
+        <w:t>Reproduced every reported bug before touching it, so the fixes hit causes and not symptoms</w:t>
       </w:r>
     </w:p>
     <w:p>
@@ -7071,7 +7071,7 @@
           <w:color w:val="1A1A1A"/>
           <w:sz w:val="19"/>
         </w:rPr>
-        <w:t>Matched the existing codebase's conventions rather than importing React Native habits into a Flutter project</w:t>
+        <w:t>Followed the conventions already in the codebase instead of importing React Native habits into a Flutter project</w:t>
       </w:r>
     </w:p>
     <w:p>
@@ -7285,7 +7285,7 @@
           <w:color w:val="1A1A1A"/>
           <w:sz w:val="19"/>
         </w:rPr>
-        <w:t>Jun 2025 — Present (Ongoing)</w:t>
+        <w:t>Jun 2025 – Present (Ongoing)</w:t>
       </w:r>
     </w:p>
     <w:p>
@@ -7634,7 +7634,7 @@
           <w:color w:val="1A1A1A"/>
           <w:sz w:val="19"/>
         </w:rPr>
-        <w:t>Built explicit validation and escalation paths so a workflow hands off to a human rather than failing quietly</w:t>
+        <w:t>Built validation and escalation paths so a workflow hands off to a human instead of failing quietly</w:t>
       </w:r>
     </w:p>
     <w:p>
@@ -7918,7 +7918,7 @@
           <w:color w:val="1A1A1A"/>
           <w:sz w:val="19"/>
         </w:rPr>
-        <w:t>Apr 2025 — Jun 2025 (3 months)</w:t>
+        <w:t>Apr 2025 – Jun 2025 (3 months)</w:t>
       </w:r>
     </w:p>
     <w:p>
@@ -8096,7 +8096,7 @@
           <w:color w:val="1A1A1A"/>
           <w:sz w:val="19"/>
         </w:rPr>
-        <w:t>Walkaround is a mobile application built on a C++ codebase — a long way from my primary React and React Native work. My C++ knowledge was basic and the system was unfamiliar. I used AI-assisted code comprehension to work through the codebase, trace the failure paths behind the reported issues, resolve the bugs, and deliver the fixes. As with Vastu, this is on my portfolio to demonstrate problem-solving in unfamiliar territory rather than to claim C++ as a core competency.</w:t>
+        <w:t>Walkaround is a mobile app built on a C++ codebase, which is a long way from my usual React and React Native work. My C++ was basic and I didn't know the system at all. I used AI to read through the codebase, trace the failure paths behind the reported issues, fix the bugs and deliver. Same as with Vastu, this is here to show problem-solving in unfamiliar territory, not to claim C++ as one of my skills.</w:t>
       </w:r>
     </w:p>
     <w:p>
@@ -8224,7 +8224,7 @@
           <w:color w:val="1A1A1A"/>
           <w:sz w:val="19"/>
         </w:rPr>
-        <w:t>Fixes needed to be surgical — broad refactoring was not an option</w:t>
+        <w:t>Fixes had to be surgical. Broad refactoring wasn't an option in code I didn't own</w:t>
       </w:r>
     </w:p>
     <w:p>
@@ -8281,7 +8281,7 @@
           <w:color w:val="1A1A1A"/>
           <w:sz w:val="19"/>
         </w:rPr>
-        <w:t>Verified behaviour empirically at each step rather than trusting assumptions about unfamiliar semantics</w:t>
+        <w:t>Checked behavior at each step instead of assuming I understood the semantics</w:t>
       </w:r>
     </w:p>
     <w:p>
@@ -8495,7 +8495,7 @@
           <w:color w:val="1A1A1A"/>
           <w:sz w:val="19"/>
         </w:rPr>
-        <w:t>Jan 2025 — Apr 2025 (4 months)</w:t>
+        <w:t>Jan 2025 – Apr 2025 (4 months)</w:t>
       </w:r>
     </w:p>
     <w:p>
@@ -8673,7 +8673,7 @@
           <w:color w:val="1A1A1A"/>
           <w:sz w:val="19"/>
         </w:rPr>
-        <w:t>CallMe is a secure communication platform that enables users to call incarcerated family members through government-approved phone numbers, subject to corrections-facility compliance requirements. The interesting engineering problem here was not the calling itself — it was that almost every user action had a compliance rule attached to it. Approved numbers, permitted contacts, and call eligibility are all determined by external authority, so the client had to treat the server as the sole source of truth on what a user was allowed to do, and communicate refusals clearly without exposing the underlying rules.</w:t>
+        <w:t>CallMe lets people call incarcerated family members through government-approved phone numbers, inside the compliance rules the corrections facilities set. The interesting engineering problem wasn't the calling. It was that almost every action a user takes has a compliance rule attached to it. Approved numbers, permitted contacts and whether a call is allowed at all are decided by an outside authority. So the app had to treat the server as the only source of truth on what a user could do, and explain refusals clearly without showing the rules behind them.</w:t>
       </w:r>
     </w:p>
     <w:p>
@@ -9114,7 +9114,7 @@
           <w:color w:val="1A1A1A"/>
           <w:sz w:val="19"/>
         </w:rPr>
-        <w:t>Nov 2024 — Mar 2025 (5 months)</w:t>
+        <w:t>Nov 2024 – Mar 2025 (5 months)</w:t>
       </w:r>
     </w:p>
     <w:p>
@@ -9391,7 +9391,7 @@
           <w:color w:val="1A1A1A"/>
           <w:sz w:val="19"/>
         </w:rPr>
-        <w:t>Optimise render performance during active sessions</w:t>
+        <w:t>Optimize render performance during active sessions</w:t>
       </w:r>
     </w:p>
     <w:p>
@@ -9477,7 +9477,7 @@
           <w:color w:val="1A1A1A"/>
           <w:sz w:val="19"/>
         </w:rPr>
-        <w:t>Scoped state deliberately and applied useMemo and useCallback where profiling showed real re-render cost, rather than by reflex</w:t>
+        <w:t>Scoped state carefully and only reached for useMemo and useCallback where profiling showed a real re-render cost</w:t>
       </w:r>
     </w:p>
     <w:p>
@@ -9536,7 +9536,7 @@
           <w:color w:val="1A1A1A"/>
           <w:sz w:val="19"/>
         </w:rPr>
-        <w:t>Delivered a production fitness application running consistently on both platforms, with the real-time tracking path performance-tuned rather than assumed.</w:t>
+        <w:t>Delivered a fitness app that runs consistently on both platforms, with the live tracking path tuned against measurements instead of guesses.</w:t>
       </w:r>
     </w:p>
     <w:p>
@@ -9760,7 +9760,7 @@
           <w:color w:val="1A1A1A"/>
           <w:sz w:val="19"/>
         </w:rPr>
-        <w:t>Sep 2024 — Nov 2024 (3 months)</w:t>
+        <w:t>Sep 2024 – Nov 2024 (3 months)</w:t>
       </w:r>
     </w:p>
     <w:p>
@@ -10015,7 +10015,7 @@
           <w:color w:val="1A1A1A"/>
           <w:sz w:val="19"/>
         </w:rPr>
-        <w:t>Journal entries are written half-asleep — capture had to be near-frictionless</w:t>
+        <w:t>Journal entries get written half-asleep, so capture had to take almost no effort</w:t>
       </w:r>
     </w:p>
     <w:p>
@@ -10029,7 +10029,7 @@
           <w:color w:val="1A1A1A"/>
           <w:sz w:val="19"/>
         </w:rPr>
-        <w:t>Language model interpretation needed framing as insight rather than fact</w:t>
+        <w:t>Model output had to read as an observation, not a fact</w:t>
       </w:r>
     </w:p>
     <w:p>
@@ -10058,7 +10058,7 @@
           <w:color w:val="1A1A1A"/>
           <w:sz w:val="19"/>
         </w:rPr>
-        <w:t>Prioritised voice capture over typing for the primary entry path</w:t>
+        <w:t>Prioritized voice capture over typing for the primary entry path</w:t>
       </w:r>
     </w:p>
     <w:p>
@@ -10072,7 +10072,7 @@
           <w:color w:val="1A1A1A"/>
           <w:sz w:val="19"/>
         </w:rPr>
-        <w:t>Presented analysis as observed patterns rather than definitive interpretation</w:t>
+        <w:t>Presented the analysis as patterns we had noticed, not as a verdict</w:t>
       </w:r>
     </w:p>
     <w:p>
@@ -10299,7 +10299,7 @@
           <w:color w:val="1A1A1A"/>
           <w:sz w:val="19"/>
         </w:rPr>
-        <w:t>Aug 2024 — Oct 2024 (3 months)</w:t>
+        <w:t>Aug 2024 – Oct 2024 (3 months)</w:t>
       </w:r>
     </w:p>
     <w:p>
@@ -10597,7 +10597,7 @@
           <w:color w:val="1A1A1A"/>
           <w:sz w:val="19"/>
         </w:rPr>
-        <w:t>Built explicit escalation rather than letting the model answer everything</w:t>
+        <w:t>Built a clear escalation path instead of letting the model answer everything</w:t>
       </w:r>
     </w:p>
     <w:p>
@@ -10852,7 +10852,7 @@
           <w:color w:val="1A1A1A"/>
           <w:sz w:val="19"/>
         </w:rPr>
-        <w:t>Jul 2024 — Sep 2024 (3 months)</w:t>
+        <w:t>Jul 2024 – Sep 2024 (3 months)</w:t>
       </w:r>
     </w:p>
     <w:p>
@@ -11405,7 +11405,7 @@
           <w:color w:val="1A1A1A"/>
           <w:sz w:val="19"/>
         </w:rPr>
-        <w:t>Jul 2024 — Sep 2024 (3 months)</w:t>
+        <w:t>Jul 2024 – Sep 2024 (3 months)</w:t>
       </w:r>
     </w:p>
     <w:p>
@@ -11703,7 +11703,7 @@
           <w:color w:val="1A1A1A"/>
           <w:sz w:val="19"/>
         </w:rPr>
-        <w:t>Modelled pets as first-class entities under an owner rather than assuming one animal per account</w:t>
+        <w:t>Modeled pets as their own entities under an owner, instead of assuming one animal per account</w:t>
       </w:r>
     </w:p>
     <w:p>
@@ -11717,7 +11717,7 @@
           <w:color w:val="1A1A1A"/>
           <w:sz w:val="19"/>
         </w:rPr>
-        <w:t>Built reminder scheduling around medication intervals rather than generic notifications</w:t>
+        <w:t>Built reminders around actual medication intervals instead of generic notifications</w:t>
       </w:r>
     </w:p>
     <w:p>
@@ -11958,7 +11958,7 @@
           <w:color w:val="1A1A1A"/>
           <w:sz w:val="19"/>
         </w:rPr>
-        <w:t>May 2024 — Aug 2024 (4 months)</w:t>
+        <w:t>May 2024 – Aug 2024 (4 months)</w:t>
       </w:r>
     </w:p>
     <w:p>
@@ -12270,7 +12270,7 @@
           <w:color w:val="1A1A1A"/>
           <w:sz w:val="19"/>
         </w:rPr>
-        <w:t>Framed assistant output as information rather than financial advice</w:t>
+        <w:t>Framed assistant output as information, never as financial advice</w:t>
       </w:r>
     </w:p>
     <w:p>
@@ -12511,7 +12511,7 @@
           <w:color w:val="1A1A1A"/>
           <w:sz w:val="19"/>
         </w:rPr>
-        <w:t>May 2024 — Jun 2024 (2 months)</w:t>
+        <w:t>May 2024 – Jun 2024 (2 months)</w:t>
       </w:r>
     </w:p>
     <w:p>
@@ -12823,7 +12823,7 @@
           <w:color w:val="1A1A1A"/>
           <w:sz w:val="19"/>
         </w:rPr>
-        <w:t>Presented carbohydrate and glucose data in plain terms rather than clinical framing</w:t>
+        <w:t>Showed carbohydrate and glucose data in plain language, not clinical terms</w:t>
       </w:r>
     </w:p>
     <w:p>
@@ -12897,7 +12897,7 @@
           <w:color w:val="1A1A1A"/>
           <w:sz w:val="19"/>
         </w:rPr>
-        <w:t>Applied SSR and CSR deliberately per view rather than uniformly</w:t>
+        <w:t>Chose SSR or CSR per view instead of applying one everywhere</w:t>
       </w:r>
     </w:p>
     <w:p>
@@ -13064,7 +13064,7 @@
           <w:color w:val="1A1A1A"/>
           <w:sz w:val="19"/>
         </w:rPr>
-        <w:t>Apr 2024 — Jul 2024 (4 months)</w:t>
+        <w:t>Apr 2024 – Jul 2024 (4 months)</w:t>
       </w:r>
     </w:p>
     <w:p>
@@ -13333,7 +13333,7 @@
           <w:color w:val="1A1A1A"/>
           <w:sz w:val="19"/>
         </w:rPr>
-        <w:t>Anonymous reporting must stay genuinely anonymous</w:t>
+        <w:t>Anonymous reporting has to actually stay anonymous</w:t>
       </w:r>
     </w:p>
     <w:p>
@@ -13617,7 +13617,7 @@
           <w:color w:val="1A1A1A"/>
           <w:sz w:val="19"/>
         </w:rPr>
-        <w:t>Mar 2024 — Jun 2024 (4 months)</w:t>
+        <w:t>Mar 2024 – Jun 2024 (4 months)</w:t>
       </w:r>
     </w:p>
     <w:p>
@@ -14170,7 +14170,7 @@
           <w:color w:val="1A1A1A"/>
           <w:sz w:val="19"/>
         </w:rPr>
-        <w:t>Dec 2023 — Mar 2024 (4 months)</w:t>
+        <w:t>Dec 2023 – Mar 2024 (4 months)</w:t>
       </w:r>
     </w:p>
     <w:p>
@@ -14216,7 +14216,7 @@
           <w:color w:val="1A1A1A"/>
           <w:sz w:val="19"/>
         </w:rPr>
-        <w:t>Zong — national telecom operator</w:t>
+        <w:t>Zong, national telecom operator</w:t>
       </w:r>
     </w:p>
     <w:p>
@@ -14505,7 +14505,7 @@
           <w:color w:val="1A1A1A"/>
           <w:sz w:val="19"/>
         </w:rPr>
-        <w:t>Made upgrade flows explicit and confirmable at each step rather than optimistic</w:t>
+        <w:t>Made upgrade flows confirmable at each step instead of optimistic</w:t>
       </w:r>
     </w:p>
     <w:p>
@@ -14746,7 +14746,7 @@
           <w:color w:val="1A1A1A"/>
           <w:sz w:val="19"/>
         </w:rPr>
-        <w:t>Nov 2023 — Jan 2024 (3 months)</w:t>
+        <w:t>Nov 2023 – Jan 2024 (3 months)</w:t>
       </w:r>
     </w:p>
     <w:p>
@@ -14792,7 +14792,7 @@
           <w:color w:val="1A1A1A"/>
           <w:sz w:val="19"/>
         </w:rPr>
-        <w:t>Ufone — national telecom operator</w:t>
+        <w:t>Ufone, national telecom operator</w:t>
       </w:r>
     </w:p>
     <w:p>
@@ -14995,7 +14995,7 @@
           <w:color w:val="1A1A1A"/>
           <w:sz w:val="19"/>
         </w:rPr>
-        <w:t>Ensure responsive behaviour and offline capability</w:t>
+        <w:t>Ensure responsive behavior and offline capability</w:t>
       </w:r>
     </w:p>
     <w:p>
@@ -15067,7 +15067,7 @@
           <w:color w:val="1A1A1A"/>
           <w:sz w:val="19"/>
         </w:rPr>
-        <w:t>Designed comparison views mobile-first, so the desktop layout was an expansion rather than a compression</w:t>
+        <w:t>Designed the comparison views mobile-first, so the desktop layout expanded outward instead of squeezing down</w:t>
       </w:r>
     </w:p>
     <w:p>
@@ -15323,7 +15323,7 @@
           <w:color w:val="1A1A1A"/>
           <w:sz w:val="19"/>
         </w:rPr>
-        <w:t>Oct 2023 — Feb 2024 (5 months)</w:t>
+        <w:t>Oct 2023 – Feb 2024 (5 months)</w:t>
       </w:r>
     </w:p>
     <w:p>
@@ -15369,7 +15369,7 @@
           <w:color w:val="1A1A1A"/>
           <w:sz w:val="19"/>
         </w:rPr>
-        <w:t>Jazz — Pakistan's largest mobile operator</w:t>
+        <w:t>Jazz, the largest mobile operator in Pakistan</w:t>
       </w:r>
     </w:p>
     <w:p>
@@ -15629,7 +15629,7 @@
           <w:color w:val="1A1A1A"/>
           <w:sz w:val="19"/>
         </w:rPr>
-        <w:t>Usage and billing data must be accurate — users check it against their own expectations</w:t>
+        <w:t>Usage and billing figures have to be right. Users check them against what they expect to see</w:t>
       </w:r>
     </w:p>
     <w:p>
@@ -15672,7 +15672,7 @@
           <w:color w:val="1A1A1A"/>
           <w:sz w:val="19"/>
         </w:rPr>
-        <w:t>Kept usage and billing figures server-rendered rather than assembled client-side</w:t>
+        <w:t>Kept usage and billing figures server-rendered instead of assembling them in the browser</w:t>
       </w:r>
     </w:p>
     <w:p>
@@ -15803,7 +15803,7 @@
           <w:color w:val="1A1A1A"/>
           <w:sz w:val="19"/>
         </w:rPr>
-        <w:t>Service customisation</w:t>
+        <w:t>Service customization</w:t>
       </w:r>
     </w:p>
     <w:p>
@@ -15913,7 +15913,7 @@
           <w:color w:val="1A1A1A"/>
           <w:sz w:val="19"/>
         </w:rPr>
-        <w:t>Feb 2023 — May 2023 (4 months)</w:t>
+        <w:t>Feb 2023 – May 2023 (4 months)</w:t>
       </w:r>
     </w:p>
     <w:p>
@@ -16211,7 +16211,7 @@
           <w:color w:val="1A1A1A"/>
           <w:sz w:val="19"/>
         </w:rPr>
-        <w:t>Surfaced availability constraints during booking rather than failing after submission</w:t>
+        <w:t>Showed availability limits while booking, so nothing failed after submission</w:t>
       </w:r>
     </w:p>
     <w:p>
@@ -16225,7 +16225,7 @@
           <w:color w:val="1A1A1A"/>
           <w:sz w:val="19"/>
         </w:rPr>
-        <w:t>Structured history around the vehicle rather than the account</w:t>
+        <w:t>Structured history around the vehicle, not the account</w:t>
       </w:r>
     </w:p>
     <w:p>
@@ -16466,7 +16466,7 @@
           <w:color w:val="1A1A1A"/>
           <w:sz w:val="19"/>
         </w:rPr>
-        <w:t>Jul 2022 — Sep 2022 (3 months)</w:t>
+        <w:t>Jul 2022 – Sep 2022 (3 months)</w:t>
       </w:r>
     </w:p>
     <w:p>
@@ -16589,7 +16589,7 @@
           <w:color w:val="1A1A1A"/>
           <w:sz w:val="19"/>
         </w:rPr>
-        <w:t>A movie discovery and review platform with advanced search, ratings, and watchlist management — an early React project.</w:t>
+        <w:t>A movie discovery and review site with search, ratings and watchlists. One of my early React projects.</w:t>
       </w:r>
     </w:p>
     <w:p>
@@ -16721,7 +16721,7 @@
           <w:color w:val="1A1A1A"/>
           <w:sz w:val="19"/>
         </w:rPr>
-        <w:t>Third-party API rate limits constrained search behaviour</w:t>
+        <w:t>Third-party API rate limits constrained search behavior</w:t>
       </w:r>
     </w:p>
     <w:p>
@@ -16778,7 +16778,7 @@
           <w:color w:val="1A1A1A"/>
           <w:sz w:val="19"/>
         </w:rPr>
-        <w:t>Kept filter state derived rather than duplicated</w:t>
+        <w:t>Kept filter state derived instead of duplicated</w:t>
       </w:r>
     </w:p>
     <w:p>
@@ -16809,7 +16809,7 @@
           <w:color w:val="1A1A1A"/>
           <w:sz w:val="19"/>
         </w:rPr>
-        <w:t>Built the React fundamentals — component composition, derived state, API integration — that the rest of my work is grounded in.</w:t>
+        <w:t>This is where I learned the React fundamentals the rest of my work sits on: component composition, derived state, API integration.</w:t>
       </w:r>
     </w:p>
     <w:p>
@@ -16990,7 +16990,7 @@
           <w:color w:val="1A1A1A"/>
           <w:sz w:val="24"/>
         </w:rPr>
-        <w:t>Leading delivery, not just writing features</w:t>
+        <w:t>Leading delivery, not only writing features</w:t>
       </w:r>
     </w:p>
     <w:p>
@@ -17006,7 +17006,7 @@
           <w:color w:val="1A1A1A"/>
           <w:sz w:val="20"/>
         </w:rPr>
-        <w:t>My official designation has usually said developer. The work has consistently included the things a technical lead does — and on my current project, all of them.</w:t>
+        <w:t>My job title has usually said developer. The work has always included what a technical lead does, and on my current project it includes all of it.</w:t>
       </w:r>
     </w:p>
     <w:p>
@@ -17038,7 +17038,7 @@
           <w:color w:val="1A1A1A"/>
           <w:sz w:val="19"/>
         </w:rPr>
-        <w:t>I currently lead a 12-person cross-functional team: frontend developers, backend developers, QA engineers, designers, and business analysts. I took it on mid-engagement when the Project Manager left, and picked up planning, task assignment, review, blocker removal, and progress tracking without a delivery pause. I run multiple projects concurrently and review everything before it reaches a client.</w:t>
+        <w:t>I lead a 12-person cross-functional team: frontend and backend developers, QA engineers, designers and business analysts. I took it on partway through the engagement when the Project Manager left, and picked up planning, task assignment, review, unblocking people and tracking progress without stopping delivery. I run several projects at once and I look at everything before it goes to a client.</w:t>
       </w:r>
     </w:p>
     <w:p>
@@ -17095,7 +17095,7 @@
           <w:color w:val="1A1A1A"/>
           <w:sz w:val="19"/>
         </w:rPr>
-        <w:t>Review completed work before client delivery</w:t>
+        <w:t>Review finished work before it goes to the client</w:t>
       </w:r>
     </w:p>
     <w:p>
@@ -17109,7 +17109,7 @@
           <w:color w:val="1A1A1A"/>
           <w:sz w:val="19"/>
         </w:rPr>
-        <w:t>Remove blockers and track project health</w:t>
+        <w:t>Clear blockers and watch project health</w:t>
       </w:r>
     </w:p>
     <w:p>
@@ -17123,7 +17123,7 @@
           <w:color w:val="1A1A1A"/>
           <w:sz w:val="19"/>
         </w:rPr>
-        <w:t>Coordinate frontend, backend, QA, design, and BA</w:t>
+        <w:t>Coordinate frontend, backend, QA, design and BA</w:t>
       </w:r>
     </w:p>
     <w:p>
@@ -17137,7 +17137,7 @@
           <w:color w:val="1A1A1A"/>
           <w:sz w:val="19"/>
         </w:rPr>
-        <w:t>Run multiple concurrent projects</w:t>
+        <w:t>Run several projects at the same time</w:t>
       </w:r>
     </w:p>
     <w:p>
@@ -17169,7 +17169,7 @@
           <w:color w:val="1A1A1A"/>
           <w:sz w:val="19"/>
         </w:rPr>
-        <w:t>I work with clients directly rather than through a layer. That means running requirement sessions, discussing new features, explaining honestly when something is not technically feasible in the shape requested, demonstrating releases, and converting the feedback into tickets the team can act on. I consistently receive positive client feedback on communication and professionalism.</w:t>
+        <w:t>I work with clients directly, not through someone else. That means running requirement sessions, talking through new features, saying honestly when something can't be built the way they've described it, demoing releases, and turning their feedback into tickets the team can pick up. Clients consistently give me good feedback on communication.</w:t>
       </w:r>
     </w:p>
     <w:p>
@@ -17212,7 +17212,7 @@
           <w:color w:val="1A1A1A"/>
           <w:sz w:val="19"/>
         </w:rPr>
-        <w:t>Present completed work and demo releases</w:t>
+        <w:t>Present finished work and demo releases</w:t>
       </w:r>
     </w:p>
     <w:p>
@@ -17240,7 +17240,7 @@
           <w:color w:val="1A1A1A"/>
           <w:sz w:val="19"/>
         </w:rPr>
-        <w:t>Translate business needs into development tasks</w:t>
+        <w:t>Turn business needs into development tasks</w:t>
       </w:r>
     </w:p>
     <w:p>
@@ -17254,7 +17254,7 @@
           <w:color w:val="1A1A1A"/>
           <w:sz w:val="19"/>
         </w:rPr>
-        <w:t>Negotiate scope against timeline</w:t>
+        <w:t>Negotiate scope against the timeline</w:t>
       </w:r>
     </w:p>
     <w:p>
@@ -17300,7 +17300,7 @@
           <w:color w:val="1A1A1A"/>
           <w:sz w:val="19"/>
         </w:rPr>
-        <w:t>I do not work ticket to ticket. I take responsibility for the outcome: understanding the business requirement behind a request, decomposing it, planning the release, identifying the risk before it becomes a delay, and staying accountable through to production.</w:t>
+        <w:t>I don't work ticket to ticket. I take responsibility for how it turns out: understanding the business need behind a request, breaking it down, planning the release, spotting risk before it becomes a delay, and staying on the hook through to production.</w:t>
       </w:r>
     </w:p>
     <w:p>
@@ -17329,7 +17329,7 @@
           <w:color w:val="1A1A1A"/>
           <w:sz w:val="19"/>
         </w:rPr>
-        <w:t>Understand the business requirement, not just the ticket</w:t>
+        <w:t>Understand the business need, not only the ticket</w:t>
       </w:r>
     </w:p>
     <w:p>
@@ -17371,7 +17371,7 @@
           <w:color w:val="1A1A1A"/>
           <w:sz w:val="19"/>
         </w:rPr>
-        <w:t>Identify and escalate risk early</w:t>
+        <w:t>Spot risk early and raise it</w:t>
       </w:r>
     </w:p>
     <w:p>
@@ -17431,7 +17431,7 @@
           <w:color w:val="1A1A1A"/>
           <w:sz w:val="19"/>
         </w:rPr>
-        <w:t>Not my official title, and regularly my responsibility. I configure Firebase, set up native Android and iOS applications, manage App Store Connect and Google Play Console, stand up development, staging, and production environments pointed at the correct backends, work with AWS Secrets Manager, and coordinate infrastructure requirements with dedicated DevOps engineers.</w:t>
+        <w:t>Not my job title, and regularly my responsibility anyway. I set up Firebase, configure the native Android and iOS apps, manage App Store Connect and Play Console, stand up dev, staging and production environments pointed at the right backends, work with AWS Secrets Manager, and sort out infrastructure needs with the DevOps engineers.</w:t>
       </w:r>
     </w:p>
     <w:p>
@@ -17460,7 +17460,7 @@
           <w:color w:val="1A1A1A"/>
           <w:sz w:val="19"/>
         </w:rPr>
-        <w:t>Firebase project and service configuration</w:t>
+        <w:t>Firebase project and service setup</w:t>
       </w:r>
     </w:p>
     <w:p>
@@ -17474,7 +17474,7 @@
           <w:color w:val="1A1A1A"/>
           <w:sz w:val="19"/>
         </w:rPr>
-        <w:t>Native Android and iOS app setup</w:t>
+        <w:t>Native Android and iOS app configuration</w:t>
       </w:r>
     </w:p>
     <w:p>
@@ -17502,7 +17502,7 @@
           <w:color w:val="1A1A1A"/>
           <w:sz w:val="19"/>
         </w:rPr>
-        <w:t>Development, staging, and production environments</w:t>
+        <w:t>Dev, staging and production environments</w:t>
       </w:r>
     </w:p>
     <w:p>
@@ -17516,7 +17516,7 @@
           <w:color w:val="1A1A1A"/>
           <w:sz w:val="19"/>
         </w:rPr>
-        <w:t>AWS Secrets Manager for credential handling</w:t>
+        <w:t>AWS Secrets Manager for credentials</w:t>
       </w:r>
     </w:p>
     <w:p>
@@ -17530,7 +17530,7 @@
           <w:color w:val="1A1A1A"/>
           <w:sz w:val="19"/>
         </w:rPr>
-        <w:t>Coordination with DevOps engineers</w:t>
+        <w:t>Working with DevOps engineers</w:t>
       </w:r>
     </w:p>
     <w:p>
@@ -17565,7 +17565,7 @@
           <w:color w:val="1A1A1A"/>
           <w:sz w:val="20"/>
         </w:rPr>
-        <w:t>I work with clients directly rather than through a layer. That means running requirement sessions, discussing new features, explaining honestly when something is not technically feasible in the shape requested, demonstrating releases, and converting the feedback into tickets the team can act on. I consistently receive positive client feedback on communication and professionalism.</w:t>
+        <w:t>I work with clients directly, not through someone else. That means running requirement sessions, talking through new features, saying honestly when something can't be built the way they've described it, demoing releases, and turning their feedback into tickets the team can pick up. Clients consistently give me good feedback on communication.</w:t>
       </w:r>
     </w:p>
     <w:p>
@@ -17608,7 +17608,7 @@
           <w:color w:val="1A1A1A"/>
           <w:sz w:val="19"/>
         </w:rPr>
-        <w:t>Present completed work and demo releases</w:t>
+        <w:t>Present finished work and demo releases</w:t>
       </w:r>
     </w:p>
     <w:p>
@@ -17636,7 +17636,7 @@
           <w:color w:val="1A1A1A"/>
           <w:sz w:val="19"/>
         </w:rPr>
-        <w:t>Translate business needs into development tasks</w:t>
+        <w:t>Turn business needs into development tasks</w:t>
       </w:r>
     </w:p>
     <w:p>
@@ -17650,7 +17650,7 @@
           <w:color w:val="1A1A1A"/>
           <w:sz w:val="19"/>
         </w:rPr>
-        <w:t>Negotiate scope against timeline</w:t>
+        <w:t>Negotiate scope against the timeline</w:t>
       </w:r>
     </w:p>
     <w:p>
@@ -17714,7 +17714,7 @@
           <w:color w:val="1A1A1A"/>
           <w:sz w:val="20"/>
         </w:rPr>
-        <w:t>The most useful skill I have picked up in the last two years is getting productive in an unfamiliar codebase fast. I use Claude, ChatGPT, and Codex as analysis tools, and I write my own specialised agents for recurring parts of my workflow.</w:t>
+        <w:t>The most useful thing I've learned in the last two years is how to get productive in a codebase I've never seen. I use Claude, ChatGPT and Codex as analysis tools, and I write my own agents for the parts of my workflow that repeat.</w:t>
       </w:r>
     </w:p>
     <w:p>
@@ -17729,7 +17729,7 @@
           <w:color w:val="1A1A1A"/>
           <w:sz w:val="21"/>
         </w:rPr>
-        <w:t>Flutter production fixes — Vastu</w:t>
+        <w:t>Flutter production fixes: Vastu</w:t>
       </w:r>
     </w:p>
     <w:p>
@@ -17746,7 +17746,7 @@
           <w:color w:val="1A1A1A"/>
           <w:sz w:val="19"/>
         </w:rPr>
-        <w:t>A client engaged us specifically to resolve production bugs in a Flutter meditation application. I had effectively no Flutter experience. I used AI-assisted analysis to build a working model of the codebase and its state handling, resolved the defects, and delivered the fixes.</w:t>
+        <w:t>A client hired us purely to fix production bugs in a Flutter meditation app. I had close to no Flutter experience. I used AI-assisted analysis to build a working picture of the codebase and how it handled state, found the causes, and delivered the fixes.</w:t>
       </w:r>
     </w:p>
     <w:p>
@@ -17770,7 +17770,7 @@
           <w:color w:val="555555"/>
           <w:sz w:val="18"/>
         </w:rPr>
-        <w:t>Not Flutter expertise — demonstrated ability to become useful in an unfamiliar framework quickly.</w:t>
+        <w:t>This isn't Flutter expertise. It's evidence I can become useful in an unfamiliar framework quickly.</w:t>
       </w:r>
     </w:p>
     <w:p>
@@ -17785,7 +17785,7 @@
           <w:color w:val="1A1A1A"/>
           <w:sz w:val="21"/>
         </w:rPr>
-        <w:t>C++ codebase debugging — Walkaround</w:t>
+        <w:t>C++ debugging: Walkaround</w:t>
       </w:r>
     </w:p>
     <w:p>
@@ -17802,7 +17802,7 @@
           <w:color w:val="1A1A1A"/>
           <w:sz w:val="19"/>
         </w:rPr>
-        <w:t>Walkaround is a mobile product built on a C++ codebase. I knew basic C++ and nothing about this system. I used AI to work through the code, isolate the failure paths, resolve the bugs, and ship the fixes.</w:t>
+        <w:t>Walkaround is a mobile product on a C++ codebase. I knew basic C++ and nothing about this particular system. I used AI to work through the code, narrow down the failure paths, fix the bugs and ship them.</w:t>
       </w:r>
     </w:p>
     <w:p>
@@ -17826,7 +17826,7 @@
           <w:color w:val="555555"/>
           <w:sz w:val="18"/>
         </w:rPr>
-        <w:t>Not C++ expertise — demonstrated problem-solving in a language and codebase outside my primary stack.</w:t>
+        <w:t>This isn't C++ expertise. It's problem-solving in a language outside my main stack.</w:t>
       </w:r>
     </w:p>
     <w:p>
@@ -17841,7 +17841,7 @@
           <w:color w:val="1A1A1A"/>
           <w:sz w:val="21"/>
         </w:rPr>
-        <w:t>Purpose-built development agents</w:t>
+        <w:t>Agents built for my own workflow</w:t>
       </w:r>
     </w:p>
     <w:p>
@@ -17858,7 +17858,7 @@
           <w:color w:val="1A1A1A"/>
           <w:sz w:val="19"/>
         </w:rPr>
-        <w:t>I build specialised AI agents configured against my own engineering standards and project conventions, so generated code arrives consistent with the architecture instead of needing to be rewritten.</w:t>
+        <w:t>I build AI agents configured against my own engineering standards and project conventions, so what comes out matches the architecture already in place and doesn't need rewriting.</w:t>
       </w:r>
     </w:p>
     <w:p>
@@ -17882,7 +17882,7 @@
           <w:color w:val="555555"/>
           <w:sz w:val="18"/>
         </w:rPr>
-        <w:t>Compounding productivity rather than one-off prompting.</w:t>
+        <w:t>Productivity that compounds, instead of one-off prompting.</w:t>
       </w:r>
     </w:p>
     <w:p>
@@ -17914,7 +17914,7 @@
           <w:color w:val="1A1A1A"/>
           <w:sz w:val="19"/>
         </w:rPr>
-        <w:t>Intelligent business workflow automations in n8n, including AI-powered customer service handling over Telegram with OpenAI-generated contextual responses, and a voice-driven order intake system combining telephony with speech processing.</w:t>
+        <w:t>Business workflow automations in n8n. That includes AI customer service over Telegram with contextual replies generated by OpenAI, and a voice order intake system that combines telephony with speech processing.</w:t>
       </w:r>
     </w:p>
     <w:p>
@@ -17938,7 +17938,7 @@
           <w:color w:val="555555"/>
           <w:sz w:val="18"/>
         </w:rPr>
-        <w:t>Automation and workflow engineering as a deliverable, not a side interest.</w:t>
+        <w:t>Automation as something I deliver, not a side interest.</w:t>
       </w:r>
     </w:p>
     <w:p>
@@ -18618,7 +18618,7 @@
           <w:color w:val="1A1A1A"/>
           <w:sz w:val="19"/>
         </w:rPr>
-        <w:t>Applied SSR and CSR deliberately per view rather than uniformly</w:t>
+        <w:t>Chose SSR or CSR per view instead of applying one everywhere</w:t>
       </w:r>
     </w:p>
     <w:p>
@@ -18969,7 +18969,7 @@
           <w:color w:val="555555"/>
           <w:sz w:val="19"/>
         </w:rPr>
-        <w:t>DHA Suffa University, Karachi, Pakistan  ·  Oct 2019 — Aug 2023</w:t>
+        <w:t>DHA Suffa University, Karachi, Pakistan  ·  Oct 2019 – Aug 2023</w:t>
       </w:r>
     </w:p>
     <w:p>
@@ -19000,7 +19000,7 @@
           <w:color w:val="555555"/>
           <w:sz w:val="19"/>
         </w:rPr>
-        <w:t>Whales College, Karachi, Pakistan  ·  Aug 2017 — Aug 2019</w:t>
+        <w:t>Whales College, Karachi, Pakistan  ·  Aug 2017 – Aug 2019</w:t>
       </w:r>
     </w:p>
     <w:p>
@@ -19052,7 +19052,7 @@
           <w:color w:val="555555"/>
           <w:sz w:val="18"/>
         </w:rPr>
-        <w:t xml:space="preserve">  —  Hazza Institute of Technology  ·  Mar 2023 — Sep 2023</w:t>
+        <w:t xml:space="preserve">  —  Hazza Institute of Technology  ·  Mar 2023 – Sep 2023</w:t>
       </w:r>
     </w:p>
     <w:p>
@@ -19085,7 +19085,7 @@
           <w:color w:val="555555"/>
           <w:sz w:val="18"/>
         </w:rPr>
-        <w:t xml:space="preserve">  —  Professional training  ·  Jan 2022 — Mar 2022</w:t>
+        <w:t xml:space="preserve">  —  Professional training  ·  Jan 2022 – Mar 2022</w:t>
       </w:r>
     </w:p>
     <w:p>
@@ -19118,7 +19118,7 @@
           <w:color w:val="555555"/>
           <w:sz w:val="18"/>
         </w:rPr>
-        <w:t xml:space="preserve">  —  Professional training  ·  Jan 2022 — Feb 2022</w:t>
+        <w:t xml:space="preserve">  —  Professional training  ·  Jan 2022 – Feb 2022</w:t>
       </w:r>
     </w:p>
     <w:p>
@@ -19240,7 +19240,7 @@
           <w:color w:val="1A1A1A"/>
           <w:sz w:val="19"/>
         </w:rPr>
-        <w:t>Anonymising is not sufficient on its own. A client can usually identify themselves and their project from an anonymised quote, so permission is still required for the quote itself.</w:t>
+        <w:t>Anonymizing is not sufficient on its own. A client can usually identify themselves and their project from an anonymized quote, so permission is still required for the quote itself.</w:t>
       </w:r>
     </w:p>
     <w:p>
@@ -19268,7 +19268,7 @@
           <w:color w:val="1A1A1A"/>
           <w:sz w:val="19"/>
         </w:rPr>
-        <w:t>Record what was agreed in the consent field so a later edit cannot accidentally promote an anonymised quote to a named one.</w:t>
+        <w:t>Record what was agreed in the consent field so a later edit cannot accidentally promote an anonymized quote to a named one.</w:t>
       </w:r>
     </w:p>
     <w:p>
@@ -19330,7 +19330,7 @@
           <w:color w:val="1A1A1A"/>
           <w:sz w:val="20"/>
         </w:rPr>
-        <w:t>Anonymised quote with role and context</w:t>
+        <w:t>Anonymized quote with role and context</w:t>
       </w:r>
     </w:p>
     <w:p>
@@ -19347,7 +19347,7 @@
           <w:color w:val="1A1A1A"/>
           <w:sz w:val="19"/>
         </w:rPr>
-        <w:t>“Product Manager, US investment platform” carries most of the credibility of a named quote with none of the personal information. Still ask permission for the quote itself. Set name and company to null and consent to “anonymised”.</w:t>
+        <w:t>“Product Manager, US investment platform” carries most of the credibility of a named quote with none of the personal information. Still ask permission for the quote itself. Set name and company to null and consent to “anonymized”.</w:t>
       </w:r>
     </w:p>
     <w:p>
@@ -19410,7 +19410,7 @@
           <w:color w:val="1A1A1A"/>
           <w:sz w:val="19"/>
         </w:rPr>
-        <w:t>Add an object to the testimonialsData array in src/app/data.js. The section renders automatically once the array is non-empty, and stays hidden while it is empty. Fields: quote, name, role, company, context, project, consent (“named” or “anonymised”).</w:t>
+        <w:t>Add an object to the testimonialsData array in src/app/data.js. The section renders automatically once the array is non-empty, and stays hidden while it is empty. Fields: quote, name, role, company, context, project, consent (“named” or “anonymized”).</w:t>
       </w:r>
     </w:p>
     <w:p>

</xml_diff>